<commit_message>
ADD: Reports Functionality in Home Page
</commit_message>
<xml_diff>
--- a/frontend/src/assets/template.docx
+++ b/frontend/src/assets/template.docx
@@ -13,6 +13,7 @@
       <w:r>
         <w:rPr>
           <w:rFonts w:asciiTheme="majorBidi" w:hAnsiTheme="majorBidi" w:cstheme="majorBidi"/>
+          <w:noProof/>
         </w:rPr>
         <w:drawing>
           <wp:inline distT="0" distB="0" distL="0" distR="0" wp14:anchorId="6452E740" wp14:editId="1B208F72">
@@ -91,7 +92,7 @@
     <w:p>
       <w:pPr>
         <w:rPr>
-          <w:rFonts w:asciiTheme="majorBidi" w:hAnsiTheme="majorBidi" w:cstheme="majorBidi"/>
+          <w:rFonts w:asciiTheme="majorBidi" w:hAnsiTheme="majorBidi" w:cstheme="majorBidi" w:hint="cs"/>
           <w:rtl/>
         </w:rPr>
       </w:pPr>
@@ -160,7 +161,29 @@
           <w:sz w:val="24"/>
           <w:szCs w:val="24"/>
         </w:rPr>
-        <w:t>{name}</w:t>
+        <w:t>{</w:t>
+      </w:r>
+      <w:proofErr w:type="spellStart"/>
+      <w:r>
+        <w:rPr>
+          <w:rFonts w:asciiTheme="majorBidi" w:hAnsiTheme="majorBidi" w:cstheme="majorBidi"/>
+          <w:b/>
+          <w:bCs/>
+          <w:sz w:val="24"/>
+          <w:szCs w:val="24"/>
+        </w:rPr>
+        <w:t>studentName</w:t>
+      </w:r>
+      <w:proofErr w:type="spellEnd"/>
+      <w:r>
+        <w:rPr>
+          <w:rFonts w:asciiTheme="majorBidi" w:hAnsiTheme="majorBidi" w:cstheme="majorBidi"/>
+          <w:b/>
+          <w:bCs/>
+          <w:sz w:val="24"/>
+          <w:szCs w:val="24"/>
+        </w:rPr>
+        <w:t>}</w:t>
       </w:r>
       <w:r>
         <w:rPr>
@@ -188,7 +211,39 @@
           <w:sz w:val="24"/>
           <w:szCs w:val="24"/>
         </w:rPr>
-        <w:t>{opportunity}</w:t>
+        <w:t>{</w:t>
+      </w:r>
+      <w:proofErr w:type="spellStart"/>
+      <w:r>
+        <w:rPr>
+          <w:rFonts w:asciiTheme="majorBidi" w:hAnsiTheme="majorBidi" w:cstheme="majorBidi"/>
+          <w:b/>
+          <w:bCs/>
+          <w:sz w:val="24"/>
+          <w:szCs w:val="24"/>
+        </w:rPr>
+        <w:t>opportunity</w:t>
+      </w:r>
+      <w:r>
+        <w:rPr>
+          <w:rFonts w:asciiTheme="majorBidi" w:hAnsiTheme="majorBidi" w:cstheme="majorBidi"/>
+          <w:b/>
+          <w:bCs/>
+          <w:sz w:val="24"/>
+          <w:szCs w:val="24"/>
+        </w:rPr>
+        <w:t>Name</w:t>
+      </w:r>
+      <w:proofErr w:type="spellEnd"/>
+      <w:r>
+        <w:rPr>
+          <w:rFonts w:asciiTheme="majorBidi" w:hAnsiTheme="majorBidi" w:cstheme="majorBidi"/>
+          <w:b/>
+          <w:bCs/>
+          <w:sz w:val="24"/>
+          <w:szCs w:val="24"/>
+        </w:rPr>
+        <w:t>}</w:t>
       </w:r>
       <w:r>
         <w:rPr>
@@ -377,18 +432,7 @@
           <w:sz w:val="24"/>
           <w:szCs w:val="24"/>
         </w:rPr>
-        <w:t>{</w:t>
-      </w:r>
-      <w:proofErr w:type="gramStart"/>
-      <w:r>
-        <w:rPr>
-          <w:rFonts w:asciiTheme="majorBidi" w:hAnsiTheme="majorBidi" w:cstheme="majorBidi"/>
-          <w:b/>
-          <w:bCs/>
-          <w:sz w:val="24"/>
-          <w:szCs w:val="24"/>
-        </w:rPr>
-        <w:t>hours}</w:t>
+        <w:t>{hours}</w:t>
       </w:r>
       <w:r>
         <w:rPr>
@@ -414,17 +458,7 @@
           <w:szCs w:val="24"/>
           <w:rtl/>
         </w:rPr>
-        <w:t>ساعات</w:t>
-      </w:r>
-      <w:proofErr w:type="gramEnd"/>
-      <w:r>
-        <w:rPr>
-          <w:rFonts w:asciiTheme="majorBidi" w:hAnsiTheme="majorBidi" w:cstheme="majorBidi"/>
-          <w:sz w:val="24"/>
-          <w:szCs w:val="24"/>
-          <w:rtl/>
-        </w:rPr>
-        <w:t xml:space="preserve"> تطوعية، وقد ساهم بشكل فعال في الفرصة التطوعية</w:t>
+        <w:t>ساعات تطوعية، وقد ساهم بشكل فعال في الفرصة التطوعية</w:t>
       </w:r>
       <w:r>
         <w:rPr>
@@ -472,16 +506,27 @@
         </w:rPr>
         <w:t>{</w:t>
       </w:r>
-      <w:proofErr w:type="gramStart"/>
-      <w:r>
-        <w:rPr>
-          <w:rFonts w:asciiTheme="majorBidi" w:hAnsiTheme="majorBidi" w:cstheme="majorBidi"/>
-          <w:b/>
-          <w:bCs/>
-          <w:sz w:val="24"/>
-          <w:szCs w:val="24"/>
-        </w:rPr>
-        <w:t>name}</w:t>
+      <w:proofErr w:type="spellStart"/>
+      <w:r>
+        <w:rPr>
+          <w:rFonts w:asciiTheme="majorBidi" w:hAnsiTheme="majorBidi" w:cstheme="majorBidi"/>
+          <w:b/>
+          <w:bCs/>
+          <w:sz w:val="24"/>
+          <w:szCs w:val="24"/>
+        </w:rPr>
+        <w:t>studentName</w:t>
+      </w:r>
+      <w:proofErr w:type="spellEnd"/>
+      <w:r>
+        <w:rPr>
+          <w:rFonts w:asciiTheme="majorBidi" w:hAnsiTheme="majorBidi" w:cstheme="majorBidi"/>
+          <w:b/>
+          <w:bCs/>
+          <w:sz w:val="24"/>
+          <w:szCs w:val="24"/>
+        </w:rPr>
+        <w:t>}</w:t>
       </w:r>
       <w:r>
         <w:rPr>
@@ -507,17 +552,7 @@
           <w:szCs w:val="24"/>
           <w:rtl/>
         </w:rPr>
-        <w:t>دوام</w:t>
-      </w:r>
-      <w:proofErr w:type="gramEnd"/>
-      <w:r>
-        <w:rPr>
-          <w:rFonts w:asciiTheme="majorBidi" w:hAnsiTheme="majorBidi" w:cstheme="majorBidi"/>
-          <w:sz w:val="24"/>
-          <w:szCs w:val="24"/>
-          <w:rtl/>
-        </w:rPr>
-        <w:t xml:space="preserve"> التوفيق والنجاح في مسيرته التطوعية المستقبلية</w:t>
+        <w:t>دوام التوفيق والنجاح في مسيرته التطوعية المستقبلية</w:t>
       </w:r>
       <w:r>
         <w:rPr>
@@ -772,6 +807,7 @@
         </v:shapetype>
         <v:shape id="WordPictureWatermark95374407" o:spid="_x0000_s1029" type="#_x0000_t75" style="position:absolute;left:0;text-align:left;margin-left:0;margin-top:0;width:415.25pt;height:404.7pt;z-index:-251657216;mso-position-horizontal:center;mso-position-horizontal-relative:margin;mso-position-vertical:center;mso-position-vertical-relative:margin" o:allowincell="f">
           <v:imagedata r:id="rId1" o:title="Group 4435" gain="19661f" blacklevel="22938f"/>
+          <w10:wrap anchorx="margin" anchory="margin"/>
         </v:shape>
       </w:pict>
     </w:r>
@@ -811,6 +847,7 @@
         </v:shapetype>
         <v:shape id="WordPictureWatermark95374408" o:spid="_x0000_s1030" type="#_x0000_t75" style="position:absolute;left:0;text-align:left;margin-left:0;margin-top:0;width:415.25pt;height:404.7pt;z-index:-251656192;mso-position-horizontal:center;mso-position-horizontal-relative:margin;mso-position-vertical:center;mso-position-vertical-relative:margin" o:allowincell="f">
           <v:imagedata r:id="rId1" o:title="Group 4435" gain="19661f" blacklevel="22938f"/>
+          <w10:wrap anchorx="margin" anchory="margin"/>
         </v:shape>
       </w:pict>
     </w:r>
@@ -850,6 +887,7 @@
         </v:shapetype>
         <v:shape id="WordPictureWatermark95374406" o:spid="_x0000_s1028" type="#_x0000_t75" style="position:absolute;left:0;text-align:left;margin-left:0;margin-top:0;width:415.25pt;height:404.7pt;z-index:-251658240;mso-position-horizontal:center;mso-position-horizontal-relative:margin;mso-position-vertical:center;mso-position-vertical-relative:margin" o:allowincell="f">
           <v:imagedata r:id="rId1" o:title="Group 4435" gain="19661f" blacklevel="22938f"/>
+          <w10:wrap anchorx="margin" anchory="margin"/>
         </v:shape>
       </w:pict>
     </w:r>

</xml_diff>